<commit_message>
Sync paper to final submitted text: new title, author emails, typo fixes
Co-authored-by: arena-agent <297053741+arena-agent@users.noreply.github.com>
</commit_message>
<xml_diff>
--- a/report/paper/HydroRainGuard_IEEE_Conference_Paper.docx
+++ b/report/paper/HydroRainGuard_IEEE_Conference_Paper.docx
@@ -16,7 +16,7 @@
           <w:smallCaps w:val="0"/>
           <w:sz w:val="48"/>
         </w:rPr>
-        <w:t>From Rooftop to Aquifer: An Open, Auditable Pipeline for Rainwater Harvesting and Artificial Recharge Assessment</w:t>
+        <w:t>HYDRO RAIN GUARD: An Auditable Decision-Support System for Rooftop Rainwater Harvesting and Artificial Groundwater Recharge</w:t>
       </w:r>
     </w:p>
     <w:tbl>
@@ -132,7 +132,98 @@
                 <w:smallCaps w:val="0"/>
                 <w:sz w:val="18"/>
               </w:rPr>
-              <w:t>roll no. ______</w:t>
+              <w:t>desaishubham696@gmail.com</w:t>
+            </w:r>
+          </w:p>
+        </w:tc>
+        <w:tc>
+          <w:tcPr>
+            <w:tcW w:type="dxa" w:w="3428"/>
+            <w:gridSpan w:val="2"/>
+          </w:tcPr>
+          <w:p>
+            <w:pPr>
+              <w:spacing w:after="0" w:line="240" w:lineRule="auto"/>
+              <w:ind w:firstLine="0"/>
+              <w:jc w:val="center"/>
+            </w:pPr>
+            <w:r>
+              <w:rPr>
+                <w:rFonts w:ascii="Times New Roman" w:hAnsi="Times New Roman" w:cs="Times New Roman" w:eastAsia="Times New Roman"/>
+                <w:b w:val="0"/>
+                <w:i w:val="0"/>
+                <w:smallCaps w:val="0"/>
+                <w:sz w:val="22"/>
+              </w:rPr>
+              <w:t>Dr. Dipali H. Patil</w:t>
+            </w:r>
+          </w:p>
+          <w:p>
+            <w:pPr>
+              <w:spacing w:after="0" w:line="240" w:lineRule="auto"/>
+              <w:ind w:firstLine="0"/>
+              <w:jc w:val="center"/>
+            </w:pPr>
+            <w:r>
+              <w:rPr>
+                <w:rFonts w:ascii="Times New Roman" w:hAnsi="Times New Roman" w:cs="Times New Roman" w:eastAsia="Times New Roman"/>
+                <w:b w:val="0"/>
+                <w:i w:val="0"/>
+                <w:smallCaps w:val="0"/>
+                <w:sz w:val="20"/>
+              </w:rPr>
+              <w:t>Department of Information Technology</w:t>
+            </w:r>
+          </w:p>
+          <w:p>
+            <w:pPr>
+              <w:spacing w:after="0" w:line="240" w:lineRule="auto"/>
+              <w:ind w:firstLine="0"/>
+              <w:jc w:val="center"/>
+            </w:pPr>
+            <w:r>
+              <w:rPr>
+                <w:rFonts w:ascii="Times New Roman" w:hAnsi="Times New Roman" w:cs="Times New Roman" w:eastAsia="Times New Roman"/>
+                <w:b w:val="0"/>
+                <w:i w:val="0"/>
+                <w:smallCaps w:val="0"/>
+                <w:sz w:val="20"/>
+              </w:rPr>
+              <w:t>JSPM's Rajarshi Shahu College of Engineering</w:t>
+            </w:r>
+          </w:p>
+          <w:p>
+            <w:pPr>
+              <w:spacing w:after="0" w:line="240" w:lineRule="auto"/>
+              <w:ind w:firstLine="0"/>
+              <w:jc w:val="center"/>
+            </w:pPr>
+            <w:r>
+              <w:rPr>
+                <w:rFonts w:ascii="Times New Roman" w:hAnsi="Times New Roman" w:cs="Times New Roman" w:eastAsia="Times New Roman"/>
+                <w:b w:val="0"/>
+                <w:i w:val="0"/>
+                <w:smallCaps w:val="0"/>
+                <w:sz w:val="20"/>
+              </w:rPr>
+              <w:t>Pune, India</w:t>
+            </w:r>
+          </w:p>
+          <w:p>
+            <w:pPr>
+              <w:spacing w:after="120" w:line="240" w:lineRule="auto"/>
+              <w:ind w:firstLine="0"/>
+              <w:jc w:val="center"/>
+            </w:pPr>
+            <w:r>
+              <w:rPr>
+                <w:rFonts w:ascii="Times New Roman" w:hAnsi="Times New Roman" w:cs="Times New Roman" w:eastAsia="Times New Roman"/>
+                <w:b w:val="0"/>
+                <w:i/>
+                <w:smallCaps w:val="0"/>
+                <w:sz w:val="18"/>
+              </w:rPr>
+              <w:t>patildipali07@gmail.com</w:t>
             </w:r>
           </w:p>
         </w:tc>
@@ -223,98 +314,7 @@
                 <w:smallCaps w:val="0"/>
                 <w:sz w:val="18"/>
               </w:rPr>
-              <w:t>roll no. ______</w:t>
-            </w:r>
-          </w:p>
-        </w:tc>
-        <w:tc>
-          <w:tcPr>
-            <w:tcW w:type="dxa" w:w="3428"/>
-            <w:gridSpan w:val="2"/>
-          </w:tcPr>
-          <w:p>
-            <w:pPr>
-              <w:spacing w:after="0" w:line="240" w:lineRule="auto"/>
-              <w:ind w:firstLine="0"/>
-              <w:jc w:val="center"/>
-            </w:pPr>
-            <w:r>
-              <w:rPr>
-                <w:rFonts w:ascii="Times New Roman" w:hAnsi="Times New Roman" w:cs="Times New Roman" w:eastAsia="Times New Roman"/>
-                <w:b w:val="0"/>
-                <w:i w:val="0"/>
-                <w:smallCaps w:val="0"/>
-                <w:sz w:val="22"/>
-              </w:rPr>
-              <w:t>Kaushal Agale</w:t>
-            </w:r>
-          </w:p>
-          <w:p>
-            <w:pPr>
-              <w:spacing w:after="0" w:line="240" w:lineRule="auto"/>
-              <w:ind w:firstLine="0"/>
-              <w:jc w:val="center"/>
-            </w:pPr>
-            <w:r>
-              <w:rPr>
-                <w:rFonts w:ascii="Times New Roman" w:hAnsi="Times New Roman" w:cs="Times New Roman" w:eastAsia="Times New Roman"/>
-                <w:b w:val="0"/>
-                <w:i w:val="0"/>
-                <w:smallCaps w:val="0"/>
-                <w:sz w:val="20"/>
-              </w:rPr>
-              <w:t>Department of Information Technology</w:t>
-            </w:r>
-          </w:p>
-          <w:p>
-            <w:pPr>
-              <w:spacing w:after="0" w:line="240" w:lineRule="auto"/>
-              <w:ind w:firstLine="0"/>
-              <w:jc w:val="center"/>
-            </w:pPr>
-            <w:r>
-              <w:rPr>
-                <w:rFonts w:ascii="Times New Roman" w:hAnsi="Times New Roman" w:cs="Times New Roman" w:eastAsia="Times New Roman"/>
-                <w:b w:val="0"/>
-                <w:i w:val="0"/>
-                <w:smallCaps w:val="0"/>
-                <w:sz w:val="20"/>
-              </w:rPr>
-              <w:t>JSPM's Rajarshi Shahu College of Engineering</w:t>
-            </w:r>
-          </w:p>
-          <w:p>
-            <w:pPr>
-              <w:spacing w:after="0" w:line="240" w:lineRule="auto"/>
-              <w:ind w:firstLine="0"/>
-              <w:jc w:val="center"/>
-            </w:pPr>
-            <w:r>
-              <w:rPr>
-                <w:rFonts w:ascii="Times New Roman" w:hAnsi="Times New Roman" w:cs="Times New Roman" w:eastAsia="Times New Roman"/>
-                <w:b w:val="0"/>
-                <w:i w:val="0"/>
-                <w:smallCaps w:val="0"/>
-                <w:sz w:val="20"/>
-              </w:rPr>
-              <w:t>Pune, India</w:t>
-            </w:r>
-          </w:p>
-          <w:p>
-            <w:pPr>
-              <w:spacing w:after="120" w:line="240" w:lineRule="auto"/>
-              <w:ind w:firstLine="0"/>
-              <w:jc w:val="center"/>
-            </w:pPr>
-            <w:r>
-              <w:rPr>
-                <w:rFonts w:ascii="Times New Roman" w:hAnsi="Times New Roman" w:cs="Times New Roman" w:eastAsia="Times New Roman"/>
-                <w:b w:val="0"/>
-                <w:i/>
-                <w:smallCaps w:val="0"/>
-                <w:sz w:val="18"/>
-              </w:rPr>
-              <w:t>roll no. ______</w:t>
+              <w:t>siddheshamahadik@gmail.com</w:t>
             </w:r>
           </w:p>
         </w:tc>
@@ -410,7 +410,7 @@
                 <w:smallCaps w:val="0"/>
                 <w:sz w:val="18"/>
               </w:rPr>
-              <w:t>roll no. ______</w:t>
+              <w:t>omkarkshirsagar2005@gmail.com</w:t>
             </w:r>
           </w:p>
         </w:tc>
@@ -433,7 +433,7 @@
                 <w:smallCaps w:val="0"/>
                 <w:sz w:val="22"/>
               </w:rPr>
-              <w:t>Dr. Dipali H. Patil</w:t>
+              <w:t>Kaushal Agale</w:t>
             </w:r>
           </w:p>
           <w:p>
@@ -501,7 +501,7 @@
                 <w:smallCaps w:val="0"/>
                 <w:sz w:val="18"/>
               </w:rPr>
-              <w:t>guide</w:t>
+              <w:t>kaushalagale907@gmail.com</w:t>
             </w:r>
           </w:p>
         </w:tc>
@@ -4196,7 +4196,7 @@
           <w:smallCaps w:val="0"/>
           <w:sz w:val="20"/>
         </w:rPr>
-        <w:t>The results page presents four headline figures, then tabs for monthly analysis, structures, cost-benefit and hydrogeology. A three-dimensional view, built with react-three-fiber, draws the recommended structure at its computed dimensions on a ground plane and supports WebXR [15] on Android devices, so a tank can placed on the actual floor before it is built. The scene is intentionally schematic; it is a communication device, not a structural drawing.</w:t>
+        <w:t>The results page presents four headline figures, then tabs for monthly analysis, structures, cost-benefit and hydrogeology. A three-dimensional view, built with react-three-fiber, draws the recommended structure at its computed dimensions on a ground plane and supports WebXR [15] on Android devices, so a tank can be placed on the actual floor before it is built. The scene is intentionally schematic; it is a communication device, not a structural drawing.</w:t>
       </w:r>
     </w:p>
     <w:p>
@@ -4351,7 +4351,7 @@
           <w:smallCaps w:val="0"/>
           <w:sz w:val="20"/>
         </w:rPr>
-        <w:t>The PDF is composed with ReportLab [16] and runs to five pages: summary, monthly water balance, structures dimensions and installation notes, economics, and assumptions with data provenance. Hindi and Marathi text required more than loading a font. ReportLab draws glyphs in logical order, so Devanagari conjuncts and matras come out reordered and disconnected unless the string is shaped first. We shape with HarfBuzz through uharfbuzz [17], convert the shaped glyph run into positioned text, and draw with Noto Sans Devanagari; a glyph-coverage check falls back to English for any character the font cannot supply. The result is that a Marathi location name entered in the form appears correctly in the heading, the tables and the recommendation text of the exported report.</w:t>
+        <w:t>The PDF is composed with ReportLab [16] and runs to five pages: summary, monthly water balance, structures with dimensions and installation notes, economics, and assumptions with data provenance. Hindi and Marathi text required more than loading a font. ReportLab draws glyphs in logical order, so Devanagari conjuncts and matras come out reordered and disconnected unless the string is shaped first. We shape with HarfBuzz through uharfbuzz [17], convert the shaped glyph run into positioned text, and draw with Noto Sans Devanagari; a glyph-coverage check falls back to English for any character the font cannot supply. The result is that a Marathi location name entered in the form appears correctly in the heading, the tables and the recommendation text of the exported report.</w:t>
       </w:r>
     </w:p>
     <w:p>

</xml_diff>